<commit_message>
Versión dia 14 de Mayo.
</commit_message>
<xml_diff>
--- a/Practica5A/Practica5A.docx
+++ b/Practica5A/Practica5A.docx
@@ -192,6 +192,7 @@
             <w:tcW w:w="1280" w:type="dxa"/>
           </w:tcPr>
           <w:p>
+            <w:proofErr w:type="gramStart"/>
             <w:r>
               <w:t>(</w:t>
             </w:r>
@@ -202,7 +203,11 @@
               <w:t>0</w:t>
             </w:r>
             <w:r>
-              <w:t>) != {Todo Riesgo, Seguro a terceros + lunas, Seguro a terceros}</w:t>
+              <w:t>) !</w:t>
+            </w:r>
+            <w:proofErr w:type="gramEnd"/>
+            <w:r>
+              <w:t>= {Todo Riesgo, Seguro a terceros + lunas, Seguro a terceros}</w:t>
             </w:r>
           </w:p>
           <w:p>
@@ -213,8 +218,13 @@
               <w:t>1</w:t>
             </w:r>
             <w:r>
-              <w:t>) null</w:t>
-            </w:r>
+              <w:t xml:space="preserve">) </w:t>
+            </w:r>
+            <w:proofErr w:type="spellStart"/>
+            <w:r>
+              <w:t>null</w:t>
+            </w:r>
+            <w:proofErr w:type="spellEnd"/>
           </w:p>
         </w:tc>
         <w:tc>
@@ -346,7 +356,15 @@
               <w:t>110</w:t>
             </w:r>
             <w:r>
-              <w:t>, inf)</w:t>
+              <w:t xml:space="preserve">, </w:t>
+            </w:r>
+            <w:proofErr w:type="spellStart"/>
+            <w:r>
+              <w:t>inf</w:t>
+            </w:r>
+            <w:proofErr w:type="spellEnd"/>
+            <w:r>
+              <w:t>)</w:t>
             </w:r>
           </w:p>
         </w:tc>
@@ -362,7 +380,15 @@
               <w:t>2</w:t>
             </w:r>
             <w:r>
-              <w:t>) (- inf, 0]</w:t>
+              <w:t xml:space="preserve">) (- </w:t>
+            </w:r>
+            <w:proofErr w:type="spellStart"/>
+            <w:r>
+              <w:t>inf</w:t>
+            </w:r>
+            <w:proofErr w:type="spellEnd"/>
+            <w:r>
+              <w:t>, 0]</w:t>
             </w:r>
           </w:p>
         </w:tc>
@@ -433,7 +459,15 @@
               <w:t>(7)</w:t>
             </w:r>
             <w:r>
-              <w:t xml:space="preserve"> (-inf, Fecha actual – 1 año)</w:t>
+              <w:t xml:space="preserve"> (-</w:t>
+            </w:r>
+            <w:proofErr w:type="spellStart"/>
+            <w:r>
+              <w:t>inf</w:t>
+            </w:r>
+            <w:proofErr w:type="spellEnd"/>
+            <w:r>
+              <w:t>, Fecha actual – 1 año)</w:t>
             </w:r>
           </w:p>
           <w:p>
@@ -479,7 +513,15 @@
               <w:t>Fecha actual</w:t>
             </w:r>
             <w:r>
-              <w:t>, inf)</w:t>
+              <w:t xml:space="preserve">, </w:t>
+            </w:r>
+            <w:proofErr w:type="spellStart"/>
+            <w:r>
+              <w:t>inf</w:t>
+            </w:r>
+            <w:proofErr w:type="spellEnd"/>
+            <w:r>
+              <w:t>)</w:t>
             </w:r>
           </w:p>
         </w:tc>
@@ -495,8 +537,13 @@
               <w:t>3</w:t>
             </w:r>
             <w:r>
-              <w:t>) null</w:t>
-            </w:r>
+              <w:t xml:space="preserve">) </w:t>
+            </w:r>
+            <w:proofErr w:type="spellStart"/>
+            <w:r>
+              <w:t>null</w:t>
+            </w:r>
+            <w:proofErr w:type="spellEnd"/>
           </w:p>
         </w:tc>
         <w:tc>
@@ -673,8 +720,13 @@
           </w:tcPr>
           <w:p>
             <w:r>
-              <w:t>(Null, 100, Fecha actual + 2 días): NullPointerException</w:t>
-            </w:r>
+              <w:t xml:space="preserve">(Null, 100, Fecha actual + 2 días): </w:t>
+            </w:r>
+            <w:proofErr w:type="spellStart"/>
+            <w:r>
+              <w:t>NullPointerException</w:t>
+            </w:r>
+            <w:proofErr w:type="spellEnd"/>
           </w:p>
         </w:tc>
       </w:tr>
@@ -714,7 +766,15 @@
           </w:tcPr>
           <w:p>
             <w:r>
-              <w:t>(Todo Riesgo, -2, mañana): PotenciaNoValidaException.</w:t>
+              <w:t xml:space="preserve">(Todo Riesgo, -2, mañana): </w:t>
+            </w:r>
+            <w:proofErr w:type="spellStart"/>
+            <w:r>
+              <w:t>PotenciaNoValidaException</w:t>
+            </w:r>
+            <w:proofErr w:type="spellEnd"/>
+            <w:r>
+              <w:t>.</w:t>
             </w:r>
           </w:p>
         </w:tc>
@@ -748,7 +808,15 @@
           </w:tcPr>
           <w:p>
             <w:r>
-              <w:t>(Todo Riesgo, 0, mañana): PotenciaNoValidaException.</w:t>
+              <w:t xml:space="preserve">(Todo Riesgo, 0, mañana): </w:t>
+            </w:r>
+            <w:proofErr w:type="spellStart"/>
+            <w:r>
+              <w:t>PotenciaNoValidaException</w:t>
+            </w:r>
+            <w:proofErr w:type="spellEnd"/>
+            <w:r>
+              <w:t>.</w:t>
             </w:r>
           </w:p>
         </w:tc>
@@ -773,8 +841,21 @@
           </w:tcPr>
           <w:p>
             <w:r>
-              <w:t>(Seguro a terceros, 45, null): NullPointerException</w:t>
-            </w:r>
+              <w:t xml:space="preserve">(Seguro a terceros, 45, </w:t>
+            </w:r>
+            <w:proofErr w:type="spellStart"/>
+            <w:r>
+              <w:t>null</w:t>
+            </w:r>
+            <w:proofErr w:type="spellEnd"/>
+            <w:r>
+              <w:t xml:space="preserve">): </w:t>
+            </w:r>
+            <w:proofErr w:type="spellStart"/>
+            <w:r>
+              <w:t>NullPointerException</w:t>
+            </w:r>
+            <w:proofErr w:type="spellEnd"/>
           </w:p>
         </w:tc>
       </w:tr>
@@ -953,7 +1034,15 @@
           </w:tcPr>
           <w:p>
             <w:r>
-              <w:t>(Seguro a terceros + lunas, 120, hoy + 4 años) : 0</w:t>
+              <w:t>(Seguro a terceros + lunas, 120, hoy + 4 años</w:t>
+            </w:r>
+            <w:proofErr w:type="gramStart"/>
+            <w:r>
+              <w:t>) :</w:t>
+            </w:r>
+            <w:proofErr w:type="gramEnd"/>
+            <w:r>
+              <w:t xml:space="preserve"> 0</w:t>
             </w:r>
           </w:p>
         </w:tc>
@@ -1287,13 +1376,7 @@
           </w:tcPr>
           <w:p>
             <w:r>
-              <w:t>(</w:t>
-            </w:r>
-            <w:r>
-              <w:t>True, 0</w:t>
-            </w:r>
-            <w:r>
-              <w:t>): 0</w:t>
+              <w:t>(True, 0): 0</w:t>
             </w:r>
           </w:p>
         </w:tc>
@@ -1387,7 +1470,7 @@
           </w:tcPr>
           <w:p>
             <w:r>
-              <w:t>(False, 1 (precio: 576)): 576 * 1 = 576-</w:t>
+              <w:t>(False, 1 (precio: 576)): 576 * 1 = 576</w:t>
             </w:r>
           </w:p>
         </w:tc>
@@ -1438,6 +1521,461 @@
         </w:tc>
       </w:tr>
     </w:tbl>
+    <w:p/>
+    <w:p/>
+    <w:p>
+      <w:pPr>
+        <w:rPr>
+          <w:b/>
+          <w:bCs/>
+          <w:i/>
+          <w:iCs/>
+          <w:sz w:val="40"/>
+          <w:szCs w:val="40"/>
+          <w:u w:val="single"/>
+        </w:rPr>
+      </w:pPr>
+      <w:r>
+        <w:rPr>
+          <w:b/>
+          <w:bCs/>
+          <w:i/>
+          <w:iCs/>
+          <w:sz w:val="40"/>
+          <w:szCs w:val="40"/>
+          <w:u w:val="single"/>
+        </w:rPr>
+        <w:t xml:space="preserve">Nota: Hay que añadir la dependencia de la diapositiva 15 del seminario de Junit (tema 5) a uno de los </w:t>
+      </w:r>
+      <w:proofErr w:type="spellStart"/>
+      <w:r>
+        <w:rPr>
+          <w:b/>
+          <w:bCs/>
+          <w:i/>
+          <w:iCs/>
+          <w:sz w:val="40"/>
+          <w:szCs w:val="40"/>
+          <w:u w:val="single"/>
+        </w:rPr>
+        <w:t>Pom</w:t>
+      </w:r>
+      <w:proofErr w:type="spellEnd"/>
+      <w:r>
+        <w:rPr>
+          <w:b/>
+          <w:bCs/>
+          <w:i/>
+          <w:iCs/>
+          <w:sz w:val="40"/>
+          <w:szCs w:val="40"/>
+          <w:u w:val="single"/>
+        </w:rPr>
+        <w:t>.</w:t>
+      </w:r>
+    </w:p>
+    <w:p>
+      <w:pPr>
+        <w:rPr>
+          <w:b/>
+          <w:bCs/>
+          <w:i/>
+          <w:iCs/>
+          <w:sz w:val="40"/>
+          <w:szCs w:val="40"/>
+          <w:u w:val="single"/>
+        </w:rPr>
+      </w:pPr>
+    </w:p>
+    <w:p>
+      <w:pPr>
+        <w:rPr>
+          <w:b/>
+          <w:bCs/>
+          <w:i/>
+          <w:iCs/>
+          <w:sz w:val="40"/>
+          <w:szCs w:val="40"/>
+          <w:u w:val="single"/>
+        </w:rPr>
+      </w:pPr>
+      <w:r>
+        <w:rPr>
+          <w:b/>
+          <w:bCs/>
+          <w:i/>
+          <w:iCs/>
+          <w:sz w:val="40"/>
+          <w:szCs w:val="40"/>
+          <w:u w:val="single"/>
+        </w:rPr>
+        <w:t>(Nota: Solo Hay que probar el caso de uso “Consulta Cliente”).</w:t>
+      </w:r>
+    </w:p>
+    <w:p/>
+    <w:p>
+      <w:r>
+        <w:t>Negocio</w:t>
+      </w:r>
+    </w:p>
+    <w:tbl>
+      <w:tblPr>
+        <w:tblStyle w:val="Tablaconcuadrcula"/>
+        <w:tblW w:w="0" w:type="auto"/>
+        <w:tblLook w:val="04A0" w:firstRow="1" w:lastRow="0" w:firstColumn="1" w:lastColumn="0" w:noHBand="0" w:noVBand="1"/>
+      </w:tblPr>
+      <w:tblGrid>
+        <w:gridCol w:w="1331"/>
+        <w:gridCol w:w="1254"/>
+        <w:gridCol w:w="1280"/>
+        <w:gridCol w:w="2084"/>
+        <w:gridCol w:w="1984"/>
+      </w:tblGrid>
+      <w:tr>
+        <w:tc>
+          <w:tcPr>
+            <w:tcW w:w="1331" w:type="dxa"/>
+          </w:tcPr>
+          <w:p>
+            <w:r>
+              <w:t>Parámetro</w:t>
+            </w:r>
+          </w:p>
+        </w:tc>
+        <w:tc>
+          <w:tcPr>
+            <w:tcW w:w="1254" w:type="dxa"/>
+          </w:tcPr>
+          <w:p>
+            <w:r>
+              <w:t>Clases Validas</w:t>
+            </w:r>
+          </w:p>
+        </w:tc>
+        <w:tc>
+          <w:tcPr>
+            <w:tcW w:w="1280" w:type="dxa"/>
+          </w:tcPr>
+          <w:p>
+            <w:r>
+              <w:t>Clases No Validas</w:t>
+            </w:r>
+          </w:p>
+        </w:tc>
+        <w:tc>
+          <w:tcPr>
+            <w:tcW w:w="4068" w:type="dxa"/>
+            <w:gridSpan w:val="2"/>
+          </w:tcPr>
+          <w:p>
+            <w:r>
+              <w:t>Valores</w:t>
+            </w:r>
+          </w:p>
+        </w:tc>
+      </w:tr>
+      <w:tr>
+        <w:tc>
+          <w:tcPr>
+            <w:tcW w:w="1331" w:type="dxa"/>
+          </w:tcPr>
+          <w:p/>
+        </w:tc>
+        <w:tc>
+          <w:tcPr>
+            <w:tcW w:w="1254" w:type="dxa"/>
+          </w:tcPr>
+          <w:p/>
+        </w:tc>
+        <w:tc>
+          <w:tcPr>
+            <w:tcW w:w="1280" w:type="dxa"/>
+          </w:tcPr>
+          <w:p/>
+        </w:tc>
+        <w:tc>
+          <w:tcPr>
+            <w:tcW w:w="2084" w:type="dxa"/>
+          </w:tcPr>
+          <w:p/>
+        </w:tc>
+        <w:tc>
+          <w:tcPr>
+            <w:tcW w:w="1984" w:type="dxa"/>
+          </w:tcPr>
+          <w:p/>
+        </w:tc>
+      </w:tr>
+      <w:tr>
+        <w:tc>
+          <w:tcPr>
+            <w:tcW w:w="1331" w:type="dxa"/>
+          </w:tcPr>
+          <w:p/>
+        </w:tc>
+        <w:tc>
+          <w:tcPr>
+            <w:tcW w:w="1254" w:type="dxa"/>
+          </w:tcPr>
+          <w:p/>
+        </w:tc>
+        <w:tc>
+          <w:tcPr>
+            <w:tcW w:w="1280" w:type="dxa"/>
+          </w:tcPr>
+          <w:p/>
+        </w:tc>
+        <w:tc>
+          <w:tcPr>
+            <w:tcW w:w="2084" w:type="dxa"/>
+          </w:tcPr>
+          <w:p/>
+        </w:tc>
+        <w:tc>
+          <w:tcPr>
+            <w:tcW w:w="1984" w:type="dxa"/>
+          </w:tcPr>
+          <w:p/>
+        </w:tc>
+      </w:tr>
+      <w:tr>
+        <w:tc>
+          <w:tcPr>
+            <w:tcW w:w="1331" w:type="dxa"/>
+          </w:tcPr>
+          <w:p/>
+        </w:tc>
+        <w:tc>
+          <w:tcPr>
+            <w:tcW w:w="1254" w:type="dxa"/>
+          </w:tcPr>
+          <w:p/>
+        </w:tc>
+        <w:tc>
+          <w:tcPr>
+            <w:tcW w:w="1280" w:type="dxa"/>
+          </w:tcPr>
+          <w:p/>
+        </w:tc>
+        <w:tc>
+          <w:tcPr>
+            <w:tcW w:w="2084" w:type="dxa"/>
+          </w:tcPr>
+          <w:p/>
+        </w:tc>
+        <w:tc>
+          <w:tcPr>
+            <w:tcW w:w="1984" w:type="dxa"/>
+          </w:tcPr>
+          <w:p/>
+        </w:tc>
+      </w:tr>
+      <w:tr>
+        <w:tc>
+          <w:tcPr>
+            <w:tcW w:w="1331" w:type="dxa"/>
+          </w:tcPr>
+          <w:p/>
+        </w:tc>
+        <w:tc>
+          <w:tcPr>
+            <w:tcW w:w="1254" w:type="dxa"/>
+          </w:tcPr>
+          <w:p/>
+        </w:tc>
+        <w:tc>
+          <w:tcPr>
+            <w:tcW w:w="1280" w:type="dxa"/>
+          </w:tcPr>
+          <w:p/>
+        </w:tc>
+        <w:tc>
+          <w:tcPr>
+            <w:tcW w:w="2084" w:type="dxa"/>
+          </w:tcPr>
+          <w:p/>
+        </w:tc>
+        <w:tc>
+          <w:tcPr>
+            <w:tcW w:w="1984" w:type="dxa"/>
+          </w:tcPr>
+          <w:p/>
+        </w:tc>
+      </w:tr>
+    </w:tbl>
+    <w:p/>
+    <w:tbl>
+      <w:tblPr>
+        <w:tblStyle w:val="Tablaconcuadrcula"/>
+        <w:tblW w:w="0" w:type="auto"/>
+        <w:tblLook w:val="04A0" w:firstRow="1" w:lastRow="0" w:firstColumn="1" w:lastColumn="0" w:noHBand="0" w:noVBand="1"/>
+      </w:tblPr>
+      <w:tblGrid>
+        <w:gridCol w:w="3823"/>
+        <w:gridCol w:w="3827"/>
+      </w:tblGrid>
+      <w:tr>
+        <w:tc>
+          <w:tcPr>
+            <w:tcW w:w="3823" w:type="dxa"/>
+          </w:tcPr>
+          <w:p>
+            <w:r>
+              <w:t>Casos de prueba validos</w:t>
+            </w:r>
+          </w:p>
+        </w:tc>
+        <w:tc>
+          <w:tcPr>
+            <w:tcW w:w="3827" w:type="dxa"/>
+          </w:tcPr>
+          <w:p>
+            <w:r>
+              <w:t>Casos de prueba no validos</w:t>
+            </w:r>
+          </w:p>
+        </w:tc>
+      </w:tr>
+      <w:tr>
+        <w:tc>
+          <w:tcPr>
+            <w:tcW w:w="3823" w:type="dxa"/>
+          </w:tcPr>
+          <w:p/>
+        </w:tc>
+        <w:tc>
+          <w:tcPr>
+            <w:tcW w:w="3827" w:type="dxa"/>
+          </w:tcPr>
+          <w:p/>
+        </w:tc>
+      </w:tr>
+      <w:tr>
+        <w:tc>
+          <w:tcPr>
+            <w:tcW w:w="3823" w:type="dxa"/>
+          </w:tcPr>
+          <w:p/>
+        </w:tc>
+        <w:tc>
+          <w:tcPr>
+            <w:tcW w:w="3827" w:type="dxa"/>
+          </w:tcPr>
+          <w:p/>
+        </w:tc>
+      </w:tr>
+      <w:tr>
+        <w:tc>
+          <w:tcPr>
+            <w:tcW w:w="3823" w:type="dxa"/>
+          </w:tcPr>
+          <w:p/>
+        </w:tc>
+        <w:tc>
+          <w:tcPr>
+            <w:tcW w:w="3827" w:type="dxa"/>
+          </w:tcPr>
+          <w:p/>
+        </w:tc>
+      </w:tr>
+      <w:tr>
+        <w:tc>
+          <w:tcPr>
+            <w:tcW w:w="3823" w:type="dxa"/>
+          </w:tcPr>
+          <w:p/>
+        </w:tc>
+        <w:tc>
+          <w:tcPr>
+            <w:tcW w:w="3827" w:type="dxa"/>
+          </w:tcPr>
+          <w:p/>
+        </w:tc>
+      </w:tr>
+      <w:tr>
+        <w:tc>
+          <w:tcPr>
+            <w:tcW w:w="3823" w:type="dxa"/>
+          </w:tcPr>
+          <w:p/>
+        </w:tc>
+        <w:tc>
+          <w:tcPr>
+            <w:tcW w:w="3827" w:type="dxa"/>
+          </w:tcPr>
+          <w:p/>
+        </w:tc>
+      </w:tr>
+      <w:tr>
+        <w:tc>
+          <w:tcPr>
+            <w:tcW w:w="3823" w:type="dxa"/>
+          </w:tcPr>
+          <w:p/>
+        </w:tc>
+        <w:tc>
+          <w:tcPr>
+            <w:tcW w:w="3827" w:type="dxa"/>
+          </w:tcPr>
+          <w:p/>
+        </w:tc>
+      </w:tr>
+      <w:tr>
+        <w:tc>
+          <w:tcPr>
+            <w:tcW w:w="3823" w:type="dxa"/>
+          </w:tcPr>
+          <w:p/>
+        </w:tc>
+        <w:tc>
+          <w:tcPr>
+            <w:tcW w:w="3827" w:type="dxa"/>
+          </w:tcPr>
+          <w:p/>
+        </w:tc>
+      </w:tr>
+      <w:tr>
+        <w:tc>
+          <w:tcPr>
+            <w:tcW w:w="3823" w:type="dxa"/>
+          </w:tcPr>
+          <w:p/>
+        </w:tc>
+        <w:tc>
+          <w:tcPr>
+            <w:tcW w:w="3827" w:type="dxa"/>
+          </w:tcPr>
+          <w:p/>
+        </w:tc>
+      </w:tr>
+    </w:tbl>
+    <w:p/>
+    <w:p>
+      <w:pPr>
+        <w:rPr>
+          <w:b/>
+          <w:bCs/>
+          <w:i/>
+          <w:iCs/>
+          <w:sz w:val="40"/>
+          <w:szCs w:val="40"/>
+          <w:u w:val="single"/>
+        </w:rPr>
+      </w:pPr>
+      <w:r>
+        <w:rPr>
+          <w:b/>
+          <w:bCs/>
+          <w:i/>
+          <w:iCs/>
+          <w:sz w:val="40"/>
+          <w:szCs w:val="40"/>
+          <w:u w:val="single"/>
+        </w:rPr>
+        <w:lastRenderedPageBreak/>
+        <w:t>(Nota: Solo Hay que probar el caso de uso “Consulta Cliente”).</w:t>
+      </w:r>
+    </w:p>
     <w:p/>
     <w:sectPr>
       <w:pgSz w:w="11906" w:h="16838"/>

</xml_diff>